<commit_message>
SƠ ĐỒ TÓM TẮT CHỨC NĂNG LUỒNG
ĐỀ NGHỊ THAM KHẢO
</commit_message>
<xml_diff>
--- a/SWP - PHÂN LUỒNG DỰ ÁN.docx
+++ b/SWP - PHÂN LUỒNG DỰ ÁN.docx
@@ -7605,15 +7605,17 @@
         <w:spacing w:before="100" w:beforeAutospacing="1" w:after="100" w:afterAutospacing="1" w:line="240" w:lineRule="auto"/>
         <w:rPr>
           <w:rFonts w:ascii="Times New Roman" w:eastAsia="Times New Roman" w:hAnsi="Times New Roman" w:cs="Times New Roman"/>
-          <w:sz w:val="24"/>
-          <w:szCs w:val="24"/>
-        </w:rPr>
-      </w:pPr>
-      <w:r>
-        <w:rPr>
-          <w:rFonts w:ascii="Times New Roman" w:eastAsia="Times New Roman" w:hAnsi="Times New Roman" w:cs="Times New Roman"/>
-          <w:b/>
-          <w:bCs/>
+          <w:color w:val="FF0000"/>
+          <w:sz w:val="24"/>
+          <w:szCs w:val="24"/>
+        </w:rPr>
+      </w:pPr>
+      <w:r>
+        <w:rPr>
+          <w:rFonts w:ascii="Times New Roman" w:eastAsia="Times New Roman" w:hAnsi="Times New Roman" w:cs="Times New Roman"/>
+          <w:b/>
+          <w:bCs/>
+          <w:color w:val="FF0000"/>
           <w:sz w:val="24"/>
           <w:szCs w:val="24"/>
         </w:rPr>
@@ -7622,6 +7624,7 @@
       <w:r>
         <w:rPr>
           <w:rFonts w:ascii="Times New Roman" w:eastAsia="Times New Roman" w:hAnsi="Times New Roman" w:cs="Times New Roman"/>
+          <w:color w:val="FF0000"/>
           <w:sz w:val="24"/>
           <w:szCs w:val="24"/>
         </w:rPr>

</xml_diff>